<commit_message>
Project test and typo fixes
</commit_message>
<xml_diff>
--- a/PROJECTREPORT_TEAM07.docx
+++ b/PROJECTREPORT_TEAM07.docx
@@ -4033,24 +4033,179 @@
           <w:sz w:val="24"/>
           <w:szCs w:val="24"/>
         </w:rPr>
-        <w:t>-&gt; How to make a JRE file : https://www.jetbrains.com/help/idea/compiling-applications.html</w:t>
-      </w:r>
-    </w:p>
-    <w:p>
-      <w:pPr>
-        <w:rPr>
-          <w:rFonts w:ascii="Times New Roman" w:hAnsi="Times New Roman" w:cs="Times New Roman"/>
-          <w:sz w:val="24"/>
-          <w:szCs w:val="24"/>
-        </w:rPr>
-      </w:pPr>
-      <w:r>
-        <w:rPr>
-          <w:rFonts w:ascii="Times New Roman" w:hAnsi="Times New Roman" w:cs="Times New Roman"/>
-          <w:sz w:val="24"/>
-          <w:szCs w:val="24"/>
-        </w:rPr>
-        <w:t>-&gt; System.setOut : https://www.tutorialspoint.com/java/lang/system_setout.htm</w:t>
+        <w:t>-&gt; How to make a J</w:t>
+      </w:r>
+      <w:r>
+        <w:rPr>
+          <w:rFonts w:ascii="Times New Roman" w:hAnsi="Times New Roman" w:cs="Times New Roman"/>
+          <w:sz w:val="24"/>
+          <w:szCs w:val="24"/>
+        </w:rPr>
+        <w:t>AR</w:t>
+      </w:r>
+      <w:r>
+        <w:rPr>
+          <w:rFonts w:ascii="Times New Roman" w:hAnsi="Times New Roman" w:cs="Times New Roman"/>
+          <w:sz w:val="24"/>
+          <w:szCs w:val="24"/>
+        </w:rPr>
+        <w:t xml:space="preserve"> file : https://www.jetbrains.com/help/idea/compiling-applications.html</w:t>
+      </w:r>
+    </w:p>
+    <w:p>
+      <w:pPr>
+        <w:rPr>
+          <w:rFonts w:ascii="Times New Roman" w:hAnsi="Times New Roman" w:cs="Times New Roman"/>
+          <w:sz w:val="24"/>
+          <w:szCs w:val="24"/>
+        </w:rPr>
+      </w:pPr>
+      <w:r>
+        <w:rPr>
+          <w:rFonts w:ascii="Times New Roman" w:hAnsi="Times New Roman" w:cs="Times New Roman"/>
+          <w:sz w:val="24"/>
+          <w:szCs w:val="24"/>
+        </w:rPr>
+        <w:t xml:space="preserve">-&gt; System.setOut : </w:t>
+      </w:r>
+      <w:hyperlink r:id="rId5" w:history="1">
+        <w:r>
+          <w:rPr>
+            <w:rStyle w:val="Kpr"/>
+            <w:rFonts w:ascii="Times New Roman" w:hAnsi="Times New Roman" w:cs="Times New Roman"/>
+            <w:sz w:val="24"/>
+            <w:szCs w:val="24"/>
+          </w:rPr>
+          <w:t>https://www.tutorialspoint.com/java/lang/system_setout.htm</w:t>
+        </w:r>
+      </w:hyperlink>
+    </w:p>
+    <w:p>
+      <w:pPr>
+        <w:rPr>
+          <w:rFonts w:ascii="Times New Roman" w:hAnsi="Times New Roman" w:cs="Times New Roman"/>
+          <w:sz w:val="24"/>
+          <w:szCs w:val="24"/>
+        </w:rPr>
+      </w:pPr>
+    </w:p>
+    <w:p>
+      <w:pPr>
+        <w:rPr>
+          <w:rFonts w:ascii="Times New Roman" w:hAnsi="Times New Roman" w:cs="Times New Roman"/>
+          <w:b/>
+          <w:bCs/>
+          <w:sz w:val="24"/>
+          <w:szCs w:val="24"/>
+        </w:rPr>
+      </w:pPr>
+      <w:r>
+        <w:rPr>
+          <w:rFonts w:ascii="Times New Roman" w:hAnsi="Times New Roman" w:cs="Times New Roman"/>
+          <w:b/>
+          <w:bCs/>
+          <w:sz w:val="24"/>
+          <w:szCs w:val="24"/>
+        </w:rPr>
+        <w:t>-*-*-*-*-*-*-*-*-*-*-*-*-*-*-*- [</w:t>
+      </w:r>
+      <w:r>
+        <w:rPr>
+          <w:rFonts w:ascii="Times New Roman" w:hAnsi="Times New Roman" w:cs="Times New Roman"/>
+          <w:b/>
+          <w:bCs/>
+          <w:sz w:val="24"/>
+          <w:szCs w:val="24"/>
+        </w:rPr>
+        <w:t xml:space="preserve"> TEAM-07</w:t>
+      </w:r>
+      <w:r>
+        <w:rPr>
+          <w:rFonts w:ascii="Times New Roman" w:hAnsi="Times New Roman" w:cs="Times New Roman"/>
+          <w:b/>
+          <w:bCs/>
+          <w:sz w:val="24"/>
+          <w:szCs w:val="24"/>
+        </w:rPr>
+        <w:t xml:space="preserve"> ] -*-*-*-*-*-*-*-*-*-*-*-*-*-*-*-*-</w:t>
+      </w:r>
+    </w:p>
+    <w:p>
+      <w:pPr>
+        <w:rPr>
+          <w:rFonts w:ascii="Times New Roman" w:hAnsi="Times New Roman" w:cs="Times New Roman"/>
+          <w:sz w:val="24"/>
+          <w:szCs w:val="24"/>
+        </w:rPr>
+      </w:pPr>
+    </w:p>
+    <w:p>
+      <w:pPr>
+        <w:rPr>
+          <w:rFonts w:ascii="Times New Roman" w:hAnsi="Times New Roman" w:cs="Times New Roman"/>
+          <w:sz w:val="24"/>
+          <w:szCs w:val="24"/>
+        </w:rPr>
+      </w:pPr>
+      <w:r>
+        <w:rPr>
+          <w:rFonts w:ascii="Times New Roman" w:hAnsi="Times New Roman" w:cs="Times New Roman"/>
+          <w:sz w:val="24"/>
+          <w:szCs w:val="24"/>
+        </w:rPr>
+        <w:t xml:space="preserve">Ahmed Safa Açıkgöz </w:t>
+      </w:r>
+    </w:p>
+    <w:p>
+      <w:pPr>
+        <w:rPr>
+          <w:rFonts w:ascii="Times New Roman" w:hAnsi="Times New Roman" w:cs="Times New Roman"/>
+          <w:sz w:val="24"/>
+          <w:szCs w:val="24"/>
+        </w:rPr>
+      </w:pPr>
+      <w:r>
+        <w:rPr>
+          <w:rFonts w:ascii="Times New Roman" w:hAnsi="Times New Roman" w:cs="Times New Roman"/>
+          <w:sz w:val="24"/>
+          <w:szCs w:val="24"/>
+        </w:rPr>
+        <w:lastRenderedPageBreak/>
+        <w:t xml:space="preserve">Ayberk Er </w:t>
+      </w:r>
+    </w:p>
+    <w:p>
+      <w:pPr>
+        <w:rPr>
+          <w:rFonts w:ascii="Times New Roman" w:hAnsi="Times New Roman" w:cs="Times New Roman"/>
+          <w:sz w:val="24"/>
+          <w:szCs w:val="24"/>
+        </w:rPr>
+      </w:pPr>
+      <w:r>
+        <w:rPr>
+          <w:rFonts w:ascii="Times New Roman" w:hAnsi="Times New Roman" w:cs="Times New Roman"/>
+          <w:sz w:val="24"/>
+          <w:szCs w:val="24"/>
+        </w:rPr>
+        <w:t>Gökberk Gök</w:t>
+      </w:r>
+    </w:p>
+    <w:p>
+      <w:pPr>
+        <w:rPr>
+          <w:rFonts w:ascii="Times New Roman" w:hAnsi="Times New Roman" w:cs="Times New Roman"/>
+          <w:sz w:val="24"/>
+          <w:szCs w:val="24"/>
+        </w:rPr>
+      </w:pPr>
+      <w:r>
+        <w:rPr>
+          <w:rFonts w:ascii="Times New Roman" w:hAnsi="Times New Roman" w:cs="Times New Roman"/>
+          <w:sz w:val="24"/>
+          <w:szCs w:val="24"/>
+        </w:rPr>
+        <w:t>Arda Temel Birinci</w:t>
       </w:r>
     </w:p>
     <w:p>
@@ -7529,7 +7684,7 @@
   <w:style w:type="paragraph" w:default="1" w:styleId="Normal">
     <w:name w:val="Normal"/>
     <w:qFormat/>
-    <w:rsid w:val="00B41A52"/>
+    <w:rsid w:val="00D57183"/>
   </w:style>
   <w:style w:type="paragraph" w:styleId="Balk1">
     <w:name w:val="heading 1"/>
@@ -8047,6 +8202,29 @@
       <w:spacing w:val="5"/>
     </w:rPr>
   </w:style>
+  <w:style w:type="character" w:styleId="Kpr">
+    <w:name w:val="Hyperlink"/>
+    <w:basedOn w:val="VarsaylanParagrafYazTipi"/>
+    <w:uiPriority w:val="99"/>
+    <w:unhideWhenUsed/>
+    <w:rsid w:val="00D57183"/>
+    <w:rPr>
+      <w:color w:val="0563C1" w:themeColor="hyperlink"/>
+      <w:u w:val="single"/>
+    </w:rPr>
+  </w:style>
+  <w:style w:type="character" w:styleId="zmlenmeyenBahsetme">
+    <w:name w:val="Unresolved Mention"/>
+    <w:basedOn w:val="VarsaylanParagrafYazTipi"/>
+    <w:uiPriority w:val="99"/>
+    <w:semiHidden/>
+    <w:unhideWhenUsed/>
+    <w:rsid w:val="00D57183"/>
+    <w:rPr>
+      <w:color w:val="605E5C"/>
+      <w:shd w:val="clear" w:color="auto" w:fill="E1DFDD"/>
+    </w:rPr>
+  </w:style>
 </w:styles>
 </file>
 

</xml_diff>